<commit_message>
ELE224L: gerçek LTspice ekran görüntüleri (Wine), imleç tabloları ve ngspice karşılaştırması
Co-Authored-By: Claude Sonnet 5.5 <noreply@anthropic.com>
Claude-Session: https://claude.ai/code/session_01Q71gHQtKJ86ZE2CtYTYSwP
</commit_message>
<xml_diff>
--- a/ele224l_on_calisma/out/EN_Experiment1_Preliminary_Report.docx
+++ b/ele224l_on_calisma/out/EN_Experiment1_Preliminary_Report.docx
@@ -8172,6 +8172,157 @@
       </w:pPr>
     </w:p>
     <w:p>
+      <w:r>
+        <w:rPr>
+          <w:rFonts w:ascii="Times New Roman" w:hAnsi="Times New Roman" w:cs="Times New Roman" w:eastAsia="Times New Roman"/>
+          <w:b w:val="0"/>
+          <w:i w:val="0"/>
+        </w:rPr>
+        <w:t xml:space="preserve">The simulation was repeated in LTspice; the waveform window with the cursors is shown in </w:t>
+      </w:r>
+      <w:r>
+        <w:rPr>
+          <w:rFonts w:ascii="Times New Roman" w:hAnsi="Times New Roman" w:cs="Times New Roman" w:eastAsia="Times New Roman"/>
+          <w:b w:val="0"/>
+          <w:i w:val="0"/>
+        </w:rPr>
+        <w:t>Figure 2.3.3</w:t>
+      </w:r>
+      <w:r>
+        <w:rPr>
+          <w:rFonts w:ascii="Times New Roman" w:hAnsi="Times New Roman" w:cs="Times New Roman" w:eastAsia="Times New Roman"/>
+          <w:b w:val="0"/>
+          <w:i w:val="0"/>
+        </w:rPr>
+        <w:t xml:space="preserve">, and the cursor readings are compared with the ngspice values at the same x in </w:t>
+      </w:r>
+      <w:r>
+        <w:rPr>
+          <w:rFonts w:ascii="Times New Roman" w:hAnsi="Times New Roman" w:cs="Times New Roman" w:eastAsia="Times New Roman"/>
+          <w:b w:val="0"/>
+          <w:i w:val="0"/>
+        </w:rPr>
+        <w:t>Table 2.3.4</w:t>
+      </w:r>
+      <w:r>
+        <w:rPr>
+          <w:rFonts w:ascii="Times New Roman" w:hAnsi="Times New Roman" w:cs="Times New Roman" w:eastAsia="Times New Roman"/>
+          <w:b w:val="0"/>
+          <w:i w:val="0"/>
+        </w:rPr>
+        <w:t>. The agreement shows that the result does not depend on the simulator.</w:t>
+      </w:r>
+    </w:p>
+    <w:p>
+      <w:pPr>
+        <w:keepNext/>
+        <w:spacing w:line="240" w:lineRule="auto"/>
+        <w:jc w:val="center"/>
+      </w:pPr>
+      <w:r>
+        <w:drawing>
+          <wp:inline xmlns:a="http://schemas.openxmlformats.org/drawingml/2006/main" xmlns:pic="http://schemas.openxmlformats.org/drawingml/2006/picture">
+            <wp:extent cx="5580000" cy="3487500"/>
+            <wp:docPr id="5" name="Picture 5"/>
+            <wp:cNvGraphicFramePr>
+              <a:graphicFrameLocks noChangeAspect="1"/>
+            </wp:cNvGraphicFramePr>
+            <a:graphic>
+              <a:graphicData uri="http://schemas.openxmlformats.org/drawingml/2006/picture">
+                <pic:pic>
+                  <pic:nvPicPr>
+                    <pic:cNvPr id="0" name="lt_e1_dc_1n4148.png"/>
+                    <pic:cNvPicPr/>
+                  </pic:nvPicPr>
+                  <pic:blipFill>
+                    <a:blip r:embed="rId14"/>
+                    <a:stretch>
+                      <a:fillRect/>
+                    </a:stretch>
+                  </pic:blipFill>
+                  <pic:spPr>
+                    <a:xfrm>
+                      <a:off x="0" y="0"/>
+                      <a:ext cx="5580000" cy="3487500"/>
+                    </a:xfrm>
+                    <a:prstGeom prst="rect"/>
+                  </pic:spPr>
+                </pic:pic>
+              </a:graphicData>
+            </a:graphic>
+          </wp:inline>
+        </w:drawing>
+      </w:r>
+    </w:p>
+    <w:p>
+      <w:pPr>
+        <w:spacing w:line="240" w:lineRule="auto" w:after="240"/>
+        <w:jc w:val="center"/>
+      </w:pPr>
+      <w:r>
+        <w:rPr>
+          <w:rFonts w:ascii="Times New Roman" w:hAnsi="Times New Roman" w:cs="Times New Roman" w:eastAsia="Times New Roman"/>
+          <w:b w:val="0"/>
+          <w:i w:val="0"/>
+          <w:sz w:val="20"/>
+        </w:rPr>
+        <w:t xml:space="preserve">Figure 2.3.3  LTspice DC sweep of the half-wave rectifier with the 1N4148 model: diode current </w:t>
+      </w:r>
+      <m:oMath>
+        <m:r>
+          <m:t>I</m:t>
+        </m:r>
+        <m:d>
+          <m:dPr>
+            <m:begChr m:val="("/>
+            <m:endChr m:val=")"/>
+            <m:sepChr m:val=""/>
+            <m:grow/>
+          </m:dPr>
+          <m:e>
+            <m:r>
+              <m:t>D</m:t>
+            </m:r>
+            <m:r>
+              <m:t>1</m:t>
+            </m:r>
+          </m:e>
+        </m:d>
+      </m:oMath>
+      <w:r>
+        <w:rPr>
+          <w:rFonts w:ascii="Times New Roman" w:hAnsi="Times New Roman" w:cs="Times New Roman" w:eastAsia="Times New Roman"/>
+          <w:b w:val="0"/>
+          <w:i w:val="0"/>
+          <w:sz w:val="20"/>
+        </w:rPr>
+        <w:t xml:space="preserve"> versus the source voltage </w:t>
+      </w:r>
+      <m:oMath>
+        <m:sSub>
+          <m:e>
+            <m:r>
+              <m:t>V</m:t>
+            </m:r>
+          </m:e>
+          <m:sub>
+            <m:r>
+              <m:t>S</m:t>
+            </m:r>
+          </m:sub>
+        </m:sSub>
+      </m:oMath>
+      <w:r>
+        <w:rPr>
+          <w:rFonts w:ascii="Times New Roman" w:hAnsi="Times New Roman" w:cs="Times New Roman" w:eastAsia="Times New Roman"/>
+          <w:b w:val="0"/>
+          <w:i w:val="0"/>
+          <w:sz w:val="20"/>
+        </w:rPr>
+        <w:t xml:space="preserve"> (x-axis); device serial number visible in the plot (device serial number: TOBB-7K3Q-0421)</w:t>
+      </w:r>
+    </w:p>
+    <w:p>
       <w:pPr>
         <w:keepNext/>
         <w:spacing w:line="240" w:lineRule="auto" w:after="80"/>
@@ -8184,7 +8335,608 @@
           <w:i w:val="0"/>
           <w:sz w:val="20"/>
         </w:rPr>
-        <w:t xml:space="preserve">Table 2.3.4  Comparison of the diode-equation calculation with the SPICE result for the 1N4148 model (Error = (SPICE </w:t>
+        <w:t xml:space="preserve">Table 2.3.4  Cursor coordinates read in </w:t>
+      </w:r>
+      <w:r>
+        <w:rPr>
+          <w:rFonts w:ascii="Times New Roman" w:hAnsi="Times New Roman" w:cs="Times New Roman" w:eastAsia="Times New Roman"/>
+          <w:b w:val="0"/>
+          <w:i w:val="0"/>
+          <w:sz w:val="20"/>
+        </w:rPr>
+        <w:t>Figure 2.3.3</w:t>
+      </w:r>
+      <w:r>
+        <w:rPr>
+          <w:rFonts w:ascii="Times New Roman" w:hAnsi="Times New Roman" w:cs="Times New Roman" w:eastAsia="Times New Roman"/>
+          <w:b w:val="0"/>
+          <w:i w:val="0"/>
+          <w:sz w:val="20"/>
+        </w:rPr>
+        <w:t xml:space="preserve"> and the ngspice values at the same x</w:t>
+      </w:r>
+    </w:p>
+    <w:tbl>
+      <w:tblPr>
+        <w:tblW w:type="auto" w:w="0"/>
+        <w:jc w:val="center"/>
+        <w:tblLayout w:type="fixed"/>
+        <w:tblLook w:firstColumn="1" w:firstRow="1" w:lastColumn="0" w:lastRow="0" w:noHBand="0" w:noVBand="1" w:val="04A0"/>
+      </w:tblPr>
+      <w:tblGrid>
+        <w:gridCol w:w="794"/>
+        <w:gridCol w:w="1928"/>
+        <w:gridCol w:w="1247"/>
+        <w:gridCol w:w="1701"/>
+        <w:gridCol w:w="1701"/>
+        <w:gridCol w:w="1474"/>
+      </w:tblGrid>
+      <w:tr>
+        <w:trPr>
+          <w:tblHeader/>
+          <w:cantSplit/>
+        </w:trPr>
+        <w:tc>
+          <w:tcPr>
+            <w:tcW w:type="dxa" w:w="794"/>
+            <w:tcBorders>
+              <w:top w:val="single" w:sz="4" w:space="0" w:color="000000"/>
+              <w:left w:val="single" w:sz="4" w:space="0" w:color="000000"/>
+              <w:bottom w:val="single" w:sz="4" w:space="0" w:color="000000"/>
+              <w:right w:val="single" w:sz="4" w:space="0" w:color="000000"/>
+            </w:tcBorders>
+            <w:shd w:val="clear" w:color="auto" w:fill="D9D9D9"/>
+          </w:tcPr>
+          <w:p>
+            <w:pPr>
+              <w:keepNext/>
+              <w:spacing w:line="240" w:lineRule="auto" w:after="20"/>
+              <w:jc w:val="left"/>
+            </w:pPr>
+            <w:r>
+              <w:rPr>
+                <w:rFonts w:ascii="Times New Roman" w:hAnsi="Times New Roman" w:cs="Times New Roman" w:eastAsia="Times New Roman"/>
+                <w:b/>
+                <w:i w:val="0"/>
+                <w:sz w:val="17"/>
+              </w:rPr>
+              <w:t>Cursor</w:t>
+            </w:r>
+          </w:p>
+        </w:tc>
+        <w:tc>
+          <w:tcPr>
+            <w:tcW w:type="dxa" w:w="1928"/>
+            <w:tcBorders>
+              <w:top w:val="single" w:sz="4" w:space="0" w:color="000000"/>
+              <w:left w:val="single" w:sz="4" w:space="0" w:color="000000"/>
+              <w:bottom w:val="single" w:sz="4" w:space="0" w:color="000000"/>
+              <w:right w:val="single" w:sz="4" w:space="0" w:color="000000"/>
+            </w:tcBorders>
+            <w:shd w:val="clear" w:color="auto" w:fill="D9D9D9"/>
+          </w:tcPr>
+          <w:p>
+            <w:pPr>
+              <w:keepNext/>
+              <w:spacing w:line="240" w:lineRule="auto" w:after="20"/>
+              <w:jc w:val="center"/>
+            </w:pPr>
+            <w:r>
+              <w:rPr>
+                <w:rFonts w:ascii="Times New Roman" w:hAnsi="Times New Roman" w:cs="Times New Roman" w:eastAsia="Times New Roman"/>
+                <w:b/>
+                <w:i w:val="0"/>
+                <w:sz w:val="17"/>
+              </w:rPr>
+              <w:t>x coordinate</w:t>
+            </w:r>
+          </w:p>
+        </w:tc>
+        <w:tc>
+          <w:tcPr>
+            <w:tcW w:type="dxa" w:w="1247"/>
+            <w:tcBorders>
+              <w:top w:val="single" w:sz="4" w:space="0" w:color="000000"/>
+              <w:left w:val="single" w:sz="4" w:space="0" w:color="000000"/>
+              <w:bottom w:val="single" w:sz="4" w:space="0" w:color="000000"/>
+              <w:right w:val="single" w:sz="4" w:space="0" w:color="000000"/>
+            </w:tcBorders>
+            <w:shd w:val="clear" w:color="auto" w:fill="D9D9D9"/>
+          </w:tcPr>
+          <w:p>
+            <w:pPr>
+              <w:keepNext/>
+              <w:spacing w:line="240" w:lineRule="auto" w:after="20"/>
+              <w:jc w:val="center"/>
+            </w:pPr>
+            <w:r>
+              <w:rPr>
+                <w:rFonts w:ascii="Times New Roman" w:hAnsi="Times New Roman" w:cs="Times New Roman" w:eastAsia="Times New Roman"/>
+                <w:b/>
+                <w:i w:val="0"/>
+                <w:sz w:val="17"/>
+              </w:rPr>
+              <w:t>Quantity</w:t>
+            </w:r>
+          </w:p>
+        </w:tc>
+        <w:tc>
+          <w:tcPr>
+            <w:tcW w:type="dxa" w:w="1701"/>
+            <w:tcBorders>
+              <w:top w:val="single" w:sz="4" w:space="0" w:color="000000"/>
+              <w:left w:val="single" w:sz="4" w:space="0" w:color="000000"/>
+              <w:bottom w:val="single" w:sz="4" w:space="0" w:color="000000"/>
+              <w:right w:val="single" w:sz="4" w:space="0" w:color="000000"/>
+            </w:tcBorders>
+            <w:shd w:val="clear" w:color="auto" w:fill="D9D9D9"/>
+          </w:tcPr>
+          <w:p>
+            <w:pPr>
+              <w:keepNext/>
+              <w:spacing w:line="240" w:lineRule="auto" w:after="20"/>
+              <w:jc w:val="center"/>
+            </w:pPr>
+            <w:r>
+              <w:rPr>
+                <w:rFonts w:ascii="Times New Roman" w:hAnsi="Times New Roman" w:cs="Times New Roman" w:eastAsia="Times New Roman"/>
+                <w:b/>
+                <w:i w:val="0"/>
+                <w:sz w:val="17"/>
+              </w:rPr>
+              <w:t>LTspice</w:t>
+            </w:r>
+          </w:p>
+        </w:tc>
+        <w:tc>
+          <w:tcPr>
+            <w:tcW w:type="dxa" w:w="1701"/>
+            <w:tcBorders>
+              <w:top w:val="single" w:sz="4" w:space="0" w:color="000000"/>
+              <w:left w:val="single" w:sz="4" w:space="0" w:color="000000"/>
+              <w:bottom w:val="single" w:sz="4" w:space="0" w:color="000000"/>
+              <w:right w:val="single" w:sz="4" w:space="0" w:color="000000"/>
+            </w:tcBorders>
+            <w:shd w:val="clear" w:color="auto" w:fill="D9D9D9"/>
+          </w:tcPr>
+          <w:p>
+            <w:pPr>
+              <w:keepNext/>
+              <w:spacing w:line="240" w:lineRule="auto" w:after="20"/>
+              <w:jc w:val="center"/>
+            </w:pPr>
+            <w:r>
+              <w:rPr>
+                <w:rFonts w:ascii="Times New Roman" w:hAnsi="Times New Roman" w:cs="Times New Roman" w:eastAsia="Times New Roman"/>
+                <w:b/>
+                <w:i w:val="0"/>
+                <w:sz w:val="17"/>
+              </w:rPr>
+              <w:t>ngspice</w:t>
+            </w:r>
+          </w:p>
+        </w:tc>
+        <w:tc>
+          <w:tcPr>
+            <w:tcW w:type="dxa" w:w="1474"/>
+            <w:tcBorders>
+              <w:top w:val="single" w:sz="4" w:space="0" w:color="000000"/>
+              <w:left w:val="single" w:sz="4" w:space="0" w:color="000000"/>
+              <w:bottom w:val="single" w:sz="4" w:space="0" w:color="000000"/>
+              <w:right w:val="single" w:sz="4" w:space="0" w:color="000000"/>
+            </w:tcBorders>
+            <w:shd w:val="clear" w:color="auto" w:fill="D9D9D9"/>
+          </w:tcPr>
+          <w:p>
+            <w:pPr>
+              <w:keepNext/>
+              <w:spacing w:line="240" w:lineRule="auto" w:after="20"/>
+              <w:jc w:val="center"/>
+            </w:pPr>
+            <w:r>
+              <w:rPr>
+                <w:rFonts w:ascii="Times New Roman" w:hAnsi="Times New Roman" w:cs="Times New Roman" w:eastAsia="Times New Roman"/>
+                <w:b/>
+                <w:i w:val="0"/>
+                <w:sz w:val="17"/>
+              </w:rPr>
+              <w:t>Difference</w:t>
+            </w:r>
+          </w:p>
+        </w:tc>
+      </w:tr>
+      <w:tr>
+        <w:trPr>
+          <w:cantSplit/>
+        </w:trPr>
+        <w:tc>
+          <w:tcPr>
+            <w:tcW w:type="dxa" w:w="794"/>
+            <w:tcBorders>
+              <w:top w:val="single" w:sz="4" w:space="0" w:color="000000"/>
+              <w:left w:val="single" w:sz="4" w:space="0" w:color="000000"/>
+              <w:bottom w:val="single" w:sz="4" w:space="0" w:color="000000"/>
+              <w:right w:val="single" w:sz="4" w:space="0" w:color="000000"/>
+            </w:tcBorders>
+          </w:tcPr>
+          <w:p>
+            <w:pPr>
+              <w:keepNext/>
+              <w:spacing w:line="240" w:lineRule="auto" w:after="20"/>
+              <w:jc w:val="left"/>
+            </w:pPr>
+            <w:r>
+              <w:rPr>
+                <w:rFonts w:ascii="Times New Roman" w:hAnsi="Times New Roman" w:cs="Times New Roman" w:eastAsia="Times New Roman"/>
+                <w:b w:val="0"/>
+                <w:i w:val="0"/>
+                <w:sz w:val="17"/>
+              </w:rPr>
+              <w:t>1</w:t>
+            </w:r>
+          </w:p>
+        </w:tc>
+        <w:tc>
+          <w:tcPr>
+            <w:tcW w:type="dxa" w:w="1928"/>
+            <w:tcBorders>
+              <w:top w:val="single" w:sz="4" w:space="0" w:color="000000"/>
+              <w:left w:val="single" w:sz="4" w:space="0" w:color="000000"/>
+              <w:bottom w:val="single" w:sz="4" w:space="0" w:color="000000"/>
+              <w:right w:val="single" w:sz="4" w:space="0" w:color="000000"/>
+            </w:tcBorders>
+          </w:tcPr>
+          <w:p>
+            <w:pPr>
+              <w:keepNext/>
+              <w:spacing w:line="240" w:lineRule="auto" w:after="20"/>
+              <w:jc w:val="center"/>
+            </w:pPr>
+            <m:oMath>
+              <m:sSub>
+                <m:e>
+                  <m:r>
+                    <m:t>V</m:t>
+                  </m:r>
+                </m:e>
+                <m:sub>
+                  <m:r>
+                    <m:t>S</m:t>
+                  </m:r>
+                </m:sub>
+              </m:sSub>
+            </m:oMath>
+            <w:r>
+              <w:rPr>
+                <w:rFonts w:ascii="Times New Roman" w:hAnsi="Times New Roman" w:cs="Times New Roman" w:eastAsia="Times New Roman"/>
+                <w:b w:val="0"/>
+                <w:i w:val="0"/>
+                <w:sz w:val="17"/>
+              </w:rPr>
+              <w:t xml:space="preserve"> = 0.65104 V</w:t>
+            </w:r>
+          </w:p>
+        </w:tc>
+        <w:tc>
+          <w:tcPr>
+            <w:tcW w:type="dxa" w:w="1247"/>
+            <w:tcBorders>
+              <w:top w:val="single" w:sz="4" w:space="0" w:color="000000"/>
+              <w:left w:val="single" w:sz="4" w:space="0" w:color="000000"/>
+              <w:bottom w:val="single" w:sz="4" w:space="0" w:color="000000"/>
+              <w:right w:val="single" w:sz="4" w:space="0" w:color="000000"/>
+            </w:tcBorders>
+          </w:tcPr>
+          <w:p>
+            <w:pPr>
+              <w:keepNext/>
+              <w:spacing w:line="240" w:lineRule="auto" w:after="20"/>
+              <w:jc w:val="center"/>
+            </w:pPr>
+            <m:oMath>
+              <m:sSub>
+                <m:e>
+                  <m:r>
+                    <m:t>I</m:t>
+                  </m:r>
+                </m:e>
+                <m:sub>
+                  <m:r>
+                    <m:t>D</m:t>
+                  </m:r>
+                </m:sub>
+              </m:sSub>
+            </m:oMath>
+          </w:p>
+        </w:tc>
+        <w:tc>
+          <w:tcPr>
+            <w:tcW w:type="dxa" w:w="1701"/>
+            <w:tcBorders>
+              <w:top w:val="single" w:sz="4" w:space="0" w:color="000000"/>
+              <w:left w:val="single" w:sz="4" w:space="0" w:color="000000"/>
+              <w:bottom w:val="single" w:sz="4" w:space="0" w:color="000000"/>
+              <w:right w:val="single" w:sz="4" w:space="0" w:color="000000"/>
+            </w:tcBorders>
+          </w:tcPr>
+          <w:p>
+            <w:pPr>
+              <w:keepNext/>
+              <w:spacing w:line="240" w:lineRule="auto" w:after="20"/>
+              <w:jc w:val="center"/>
+            </w:pPr>
+            <w:r>
+              <w:rPr>
+                <w:rFonts w:ascii="Times New Roman" w:hAnsi="Times New Roman" w:cs="Times New Roman" w:eastAsia="Times New Roman"/>
+                <w:b w:val="0"/>
+                <w:i w:val="0"/>
+                <w:sz w:val="17"/>
+              </w:rPr>
+              <w:t>152.12 µA</w:t>
+            </w:r>
+          </w:p>
+        </w:tc>
+        <w:tc>
+          <w:tcPr>
+            <w:tcW w:type="dxa" w:w="1701"/>
+            <w:tcBorders>
+              <w:top w:val="single" w:sz="4" w:space="0" w:color="000000"/>
+              <w:left w:val="single" w:sz="4" w:space="0" w:color="000000"/>
+              <w:bottom w:val="single" w:sz="4" w:space="0" w:color="000000"/>
+              <w:right w:val="single" w:sz="4" w:space="0" w:color="000000"/>
+            </w:tcBorders>
+          </w:tcPr>
+          <w:p>
+            <w:pPr>
+              <w:keepNext/>
+              <w:spacing w:line="240" w:lineRule="auto" w:after="20"/>
+              <w:jc w:val="center"/>
+            </w:pPr>
+            <w:r>
+              <w:rPr>
+                <w:rFonts w:ascii="Times New Roman" w:hAnsi="Times New Roman" w:cs="Times New Roman" w:eastAsia="Times New Roman"/>
+                <w:b w:val="0"/>
+                <w:i w:val="0"/>
+                <w:sz w:val="17"/>
+              </w:rPr>
+              <w:t>152.12 µA</w:t>
+            </w:r>
+          </w:p>
+        </w:tc>
+        <w:tc>
+          <w:tcPr>
+            <w:tcW w:type="dxa" w:w="1474"/>
+            <w:tcBorders>
+              <w:top w:val="single" w:sz="4" w:space="0" w:color="000000"/>
+              <w:left w:val="single" w:sz="4" w:space="0" w:color="000000"/>
+              <w:bottom w:val="single" w:sz="4" w:space="0" w:color="000000"/>
+              <w:right w:val="single" w:sz="4" w:space="0" w:color="000000"/>
+            </w:tcBorders>
+          </w:tcPr>
+          <w:p>
+            <w:pPr>
+              <w:keepNext/>
+              <w:spacing w:line="240" w:lineRule="auto" w:after="20"/>
+              <w:jc w:val="center"/>
+            </w:pPr>
+            <w:r>
+              <w:rPr>
+                <w:rFonts w:ascii="Times New Roman" w:hAnsi="Times New Roman" w:cs="Times New Roman" w:eastAsia="Times New Roman"/>
+                <w:b w:val="0"/>
+                <w:i w:val="0"/>
+                <w:sz w:val="17"/>
+              </w:rPr>
+              <w:t>-0.000%</w:t>
+            </w:r>
+          </w:p>
+        </w:tc>
+      </w:tr>
+      <w:tr>
+        <w:trPr>
+          <w:cantSplit/>
+        </w:trPr>
+        <w:tc>
+          <w:tcPr>
+            <w:tcW w:type="dxa" w:w="794"/>
+            <w:tcBorders>
+              <w:top w:val="single" w:sz="4" w:space="0" w:color="000000"/>
+              <w:left w:val="single" w:sz="4" w:space="0" w:color="000000"/>
+              <w:bottom w:val="single" w:sz="4" w:space="0" w:color="000000"/>
+              <w:right w:val="single" w:sz="4" w:space="0" w:color="000000"/>
+            </w:tcBorders>
+          </w:tcPr>
+          <w:p>
+            <w:pPr>
+              <w:keepNext w:val="0"/>
+              <w:spacing w:line="240" w:lineRule="auto" w:after="20"/>
+              <w:jc w:val="left"/>
+            </w:pPr>
+            <w:r>
+              <w:rPr>
+                <w:rFonts w:ascii="Times New Roman" w:hAnsi="Times New Roman" w:cs="Times New Roman" w:eastAsia="Times New Roman"/>
+                <w:b w:val="0"/>
+                <w:i w:val="0"/>
+                <w:sz w:val="17"/>
+              </w:rPr>
+              <w:t>2</w:t>
+            </w:r>
+          </w:p>
+        </w:tc>
+        <w:tc>
+          <w:tcPr>
+            <w:tcW w:type="dxa" w:w="1928"/>
+            <w:tcBorders>
+              <w:top w:val="single" w:sz="4" w:space="0" w:color="000000"/>
+              <w:left w:val="single" w:sz="4" w:space="0" w:color="000000"/>
+              <w:bottom w:val="single" w:sz="4" w:space="0" w:color="000000"/>
+              <w:right w:val="single" w:sz="4" w:space="0" w:color="000000"/>
+            </w:tcBorders>
+          </w:tcPr>
+          <w:p>
+            <w:pPr>
+              <w:keepNext w:val="0"/>
+              <w:spacing w:line="240" w:lineRule="auto" w:after="20"/>
+              <w:jc w:val="center"/>
+            </w:pPr>
+            <m:oMath>
+              <m:sSub>
+                <m:e>
+                  <m:r>
+                    <m:t>V</m:t>
+                  </m:r>
+                </m:e>
+                <m:sub>
+                  <m:r>
+                    <m:t>S</m:t>
+                  </m:r>
+                </m:sub>
+              </m:sSub>
+            </m:oMath>
+            <w:r>
+              <w:rPr>
+                <w:rFonts w:ascii="Times New Roman" w:hAnsi="Times New Roman" w:cs="Times New Roman" w:eastAsia="Times New Roman"/>
+                <w:b w:val="0"/>
+                <w:i w:val="0"/>
+                <w:sz w:val="17"/>
+              </w:rPr>
+              <w:t xml:space="preserve"> = 5 V</w:t>
+            </w:r>
+          </w:p>
+        </w:tc>
+        <w:tc>
+          <w:tcPr>
+            <w:tcW w:type="dxa" w:w="1247"/>
+            <w:tcBorders>
+              <w:top w:val="single" w:sz="4" w:space="0" w:color="000000"/>
+              <w:left w:val="single" w:sz="4" w:space="0" w:color="000000"/>
+              <w:bottom w:val="single" w:sz="4" w:space="0" w:color="000000"/>
+              <w:right w:val="single" w:sz="4" w:space="0" w:color="000000"/>
+            </w:tcBorders>
+          </w:tcPr>
+          <w:p>
+            <w:pPr>
+              <w:keepNext w:val="0"/>
+              <w:spacing w:line="240" w:lineRule="auto" w:after="20"/>
+              <w:jc w:val="center"/>
+            </w:pPr>
+            <m:oMath>
+              <m:sSub>
+                <m:e>
+                  <m:r>
+                    <m:t>I</m:t>
+                  </m:r>
+                </m:e>
+                <m:sub>
+                  <m:r>
+                    <m:t>D</m:t>
+                  </m:r>
+                </m:sub>
+              </m:sSub>
+            </m:oMath>
+          </w:p>
+        </w:tc>
+        <w:tc>
+          <w:tcPr>
+            <w:tcW w:type="dxa" w:w="1701"/>
+            <w:tcBorders>
+              <w:top w:val="single" w:sz="4" w:space="0" w:color="000000"/>
+              <w:left w:val="single" w:sz="4" w:space="0" w:color="000000"/>
+              <w:bottom w:val="single" w:sz="4" w:space="0" w:color="000000"/>
+              <w:right w:val="single" w:sz="4" w:space="0" w:color="000000"/>
+            </w:tcBorders>
+          </w:tcPr>
+          <w:p>
+            <w:pPr>
+              <w:keepNext w:val="0"/>
+              <w:spacing w:line="240" w:lineRule="auto" w:after="20"/>
+              <w:jc w:val="center"/>
+            </w:pPr>
+            <w:r>
+              <w:rPr>
+                <w:rFonts w:ascii="Times New Roman" w:hAnsi="Times New Roman" w:cs="Times New Roman" w:eastAsia="Times New Roman"/>
+                <w:b w:val="0"/>
+                <w:i w:val="0"/>
+                <w:sz w:val="17"/>
+              </w:rPr>
+              <w:t>4.3468 mA</w:t>
+            </w:r>
+          </w:p>
+        </w:tc>
+        <w:tc>
+          <w:tcPr>
+            <w:tcW w:type="dxa" w:w="1701"/>
+            <w:tcBorders>
+              <w:top w:val="single" w:sz="4" w:space="0" w:color="000000"/>
+              <w:left w:val="single" w:sz="4" w:space="0" w:color="000000"/>
+              <w:bottom w:val="single" w:sz="4" w:space="0" w:color="000000"/>
+              <w:right w:val="single" w:sz="4" w:space="0" w:color="000000"/>
+            </w:tcBorders>
+          </w:tcPr>
+          <w:p>
+            <w:pPr>
+              <w:keepNext w:val="0"/>
+              <w:spacing w:line="240" w:lineRule="auto" w:after="20"/>
+              <w:jc w:val="center"/>
+            </w:pPr>
+            <w:r>
+              <w:rPr>
+                <w:rFonts w:ascii="Times New Roman" w:hAnsi="Times New Roman" w:cs="Times New Roman" w:eastAsia="Times New Roman"/>
+                <w:b w:val="0"/>
+                <w:i w:val="0"/>
+                <w:sz w:val="17"/>
+              </w:rPr>
+              <w:t>4.3468 mA</w:t>
+            </w:r>
+          </w:p>
+        </w:tc>
+        <w:tc>
+          <w:tcPr>
+            <w:tcW w:type="dxa" w:w="1474"/>
+            <w:tcBorders>
+              <w:top w:val="single" w:sz="4" w:space="0" w:color="000000"/>
+              <w:left w:val="single" w:sz="4" w:space="0" w:color="000000"/>
+              <w:bottom w:val="single" w:sz="4" w:space="0" w:color="000000"/>
+              <w:right w:val="single" w:sz="4" w:space="0" w:color="000000"/>
+            </w:tcBorders>
+          </w:tcPr>
+          <w:p>
+            <w:pPr>
+              <w:keepNext w:val="0"/>
+              <w:spacing w:line="240" w:lineRule="auto" w:after="20"/>
+              <w:jc w:val="center"/>
+            </w:pPr>
+            <w:r>
+              <w:rPr>
+                <w:rFonts w:ascii="Times New Roman" w:hAnsi="Times New Roman" w:cs="Times New Roman" w:eastAsia="Times New Roman"/>
+                <w:b w:val="0"/>
+                <w:i w:val="0"/>
+                <w:sz w:val="17"/>
+              </w:rPr>
+              <w:t>+0.000%</w:t>
+            </w:r>
+          </w:p>
+        </w:tc>
+      </w:tr>
+    </w:tbl>
+    <w:p>
+      <w:pPr>
+        <w:spacing w:after="120"/>
+      </w:pPr>
+    </w:p>
+    <w:p>
+      <w:pPr>
+        <w:keepNext/>
+        <w:spacing w:line="240" w:lineRule="auto" w:after="80"/>
+        <w:jc w:val="center"/>
+      </w:pPr>
+      <w:r>
+        <w:rPr>
+          <w:rFonts w:ascii="Times New Roman" w:hAnsi="Times New Roman" w:cs="Times New Roman" w:eastAsia="Times New Roman"/>
+          <w:b w:val="0"/>
+          <w:i w:val="0"/>
+          <w:sz w:val="20"/>
+        </w:rPr>
+        <w:t xml:space="preserve">Table 2.3.5  Comparison of the diode-equation calculation with the SPICE result for the 1N4148 model (Error = (SPICE </w:t>
       </w:r>
       <m:oMath>
         <m:r>
@@ -9921,7 +10673,7 @@
           <w:i w:val="0"/>
           <w:sz w:val="20"/>
         </w:rPr>
-        <w:t>Table 2.3.5  Diode current predicted by the three models; the percentage in parentheses is the deviation from the SPICE value</w:t>
+        <w:t>Table 2.3.6  Diode current predicted by the three models; the percentage in parentheses is the deviation from the SPICE value</w:t>
       </w:r>
     </w:p>
     <w:tbl>
@@ -10771,7 +11523,7 @@
           <w:b w:val="0"/>
           <w:i w:val="0"/>
         </w:rPr>
-        <w:t>Table 2.3.4</w:t>
+        <w:t>Table 2.3.5</w:t>
       </w:r>
       <w:r>
         <w:rPr>
@@ -10787,7 +11539,7 @@
           <w:b w:val="0"/>
           <w:i w:val="0"/>
         </w:rPr>
-        <w:t>Table 2.3.5</w:t>
+        <w:t>Table 2.3.6</w:t>
       </w:r>
       <w:r>
         <w:rPr>
@@ -11432,7 +12184,7 @@
         <w:drawing>
           <wp:inline xmlns:a="http://schemas.openxmlformats.org/drawingml/2006/main" xmlns:pic="http://schemas.openxmlformats.org/drawingml/2006/picture">
             <wp:extent cx="4860000" cy="2229882"/>
-            <wp:docPr id="5" name="Picture 5"/>
+            <wp:docPr id="6" name="Picture 6"/>
             <wp:cNvGraphicFramePr>
               <a:graphicFrameLocks noChangeAspect="1"/>
             </wp:cNvGraphicFramePr>
@@ -11444,7 +12196,7 @@
                     <pic:cNvPicPr/>
                   </pic:nvPicPr>
                   <pic:blipFill>
-                    <a:blip r:embed="rId14"/>
+                    <a:blip r:embed="rId15"/>
                     <a:stretch>
                       <a:fillRect/>
                     </a:stretch>
@@ -12091,7 +12843,7 @@
         <w:drawing>
           <wp:inline xmlns:a="http://schemas.openxmlformats.org/drawingml/2006/main" xmlns:pic="http://schemas.openxmlformats.org/drawingml/2006/picture">
             <wp:extent cx="4860000" cy="2229882"/>
-            <wp:docPr id="6" name="Picture 6"/>
+            <wp:docPr id="7" name="Picture 7"/>
             <wp:cNvGraphicFramePr>
               <a:graphicFrameLocks noChangeAspect="1"/>
             </wp:cNvGraphicFramePr>
@@ -12103,7 +12855,7 @@
                     <pic:cNvPicPr/>
                   </pic:nvPicPr>
                   <pic:blipFill>
-                    <a:blip r:embed="rId15"/>
+                    <a:blip r:embed="rId16"/>
                     <a:stretch>
                       <a:fillRect/>
                     </a:stretch>
@@ -12136,6 +12888,723 @@
         </w:rPr>
         <w:t>Figure 2.4.2  Transient simulation of the rectifier with the 1N4148 model compared with the CVD prediction (ngspice).</w:t>
       </w:r>
+    </w:p>
+    <w:p>
+      <w:r>
+        <w:rPr>
+          <w:rFonts w:ascii="Times New Roman" w:hAnsi="Times New Roman" w:cs="Times New Roman" w:eastAsia="Times New Roman"/>
+          <w:b w:val="0"/>
+          <w:i w:val="0"/>
+        </w:rPr>
+        <w:t xml:space="preserve">The LTspice result for this case is shown in </w:t>
+      </w:r>
+      <w:r>
+        <w:rPr>
+          <w:rFonts w:ascii="Times New Roman" w:hAnsi="Times New Roman" w:cs="Times New Roman" w:eastAsia="Times New Roman"/>
+          <w:b w:val="0"/>
+          <w:i w:val="0"/>
+        </w:rPr>
+        <w:t>Figure 2.4.3</w:t>
+      </w:r>
+      <w:r>
+        <w:rPr>
+          <w:rFonts w:ascii="Times New Roman" w:hAnsi="Times New Roman" w:cs="Times New Roman" w:eastAsia="Times New Roman"/>
+          <w:b w:val="0"/>
+          <w:i w:val="0"/>
+        </w:rPr>
+        <w:t xml:space="preserve"> and the cursor comparison is given in </w:t>
+      </w:r>
+      <w:r>
+        <w:rPr>
+          <w:rFonts w:ascii="Times New Roman" w:hAnsi="Times New Roman" w:cs="Times New Roman" w:eastAsia="Times New Roman"/>
+          <w:b w:val="0"/>
+          <w:i w:val="0"/>
+        </w:rPr>
+        <w:t>Table 2.4.2</w:t>
+      </w:r>
+      <w:r>
+        <w:rPr>
+          <w:rFonts w:ascii="Times New Roman" w:hAnsi="Times New Roman" w:cs="Times New Roman" w:eastAsia="Times New Roman"/>
+          <w:b w:val="0"/>
+          <w:i w:val="0"/>
+        </w:rPr>
+        <w:t>.</w:t>
+      </w:r>
+    </w:p>
+    <w:p>
+      <w:pPr>
+        <w:keepNext/>
+        <w:spacing w:line="240" w:lineRule="auto"/>
+        <w:jc w:val="center"/>
+      </w:pPr>
+      <w:r>
+        <w:drawing>
+          <wp:inline xmlns:a="http://schemas.openxmlformats.org/drawingml/2006/main" xmlns:pic="http://schemas.openxmlformats.org/drawingml/2006/picture">
+            <wp:extent cx="5580000" cy="3487500"/>
+            <wp:docPr id="8" name="Picture 8"/>
+            <wp:cNvGraphicFramePr>
+              <a:graphicFrameLocks noChangeAspect="1"/>
+            </wp:cNvGraphicFramePr>
+            <a:graphic>
+              <a:graphicData uri="http://schemas.openxmlformats.org/drawingml/2006/picture">
+                <pic:pic>
+                  <pic:nvPicPr>
+                    <pic:cNvPr id="0" name="lt_e1_tran.png"/>
+                    <pic:cNvPicPr/>
+                  </pic:nvPicPr>
+                  <pic:blipFill>
+                    <a:blip r:embed="rId17"/>
+                    <a:stretch>
+                      <a:fillRect/>
+                    </a:stretch>
+                  </pic:blipFill>
+                  <pic:spPr>
+                    <a:xfrm>
+                      <a:off x="0" y="0"/>
+                      <a:ext cx="5580000" cy="3487500"/>
+                    </a:xfrm>
+                    <a:prstGeom prst="rect"/>
+                  </pic:spPr>
+                </pic:pic>
+              </a:graphicData>
+            </a:graphic>
+          </wp:inline>
+        </w:drawing>
+      </w:r>
+    </w:p>
+    <w:p>
+      <w:pPr>
+        <w:spacing w:line="240" w:lineRule="auto" w:after="240"/>
+        <w:jc w:val="center"/>
+      </w:pPr>
+      <w:r>
+        <w:rPr>
+          <w:rFonts w:ascii="Times New Roman" w:hAnsi="Times New Roman" w:cs="Times New Roman" w:eastAsia="Times New Roman"/>
+          <w:b w:val="0"/>
+          <w:i w:val="0"/>
+          <w:sz w:val="20"/>
+        </w:rPr>
+        <w:t>Figure 2.4.3  LTspice transient simulation of the rectifier (</w:t>
+      </w:r>
+      <m:oMath>
+        <m:sSub>
+          <m:e>
+            <m:r>
+              <m:t>V</m:t>
+            </m:r>
+          </m:e>
+          <m:sub>
+            <m:r>
+              <m:t>S</m:t>
+            </m:r>
+          </m:sub>
+        </m:sSub>
+      </m:oMath>
+      <w:r>
+        <w:rPr>
+          <w:rFonts w:ascii="Times New Roman" w:hAnsi="Times New Roman" w:cs="Times New Roman" w:eastAsia="Times New Roman"/>
+          <w:b w:val="0"/>
+          <w:i w:val="0"/>
+          <w:sz w:val="20"/>
+        </w:rPr>
+        <w:t xml:space="preserve">: green, </w:t>
+      </w:r>
+      <m:oMath>
+        <m:sSub>
+          <m:e>
+            <m:r>
+              <m:t>V</m:t>
+            </m:r>
+          </m:e>
+          <m:sub>
+            <m:r>
+              <m:t>O</m:t>
+            </m:r>
+          </m:sub>
+        </m:sSub>
+      </m:oMath>
+      <w:r>
+        <w:rPr>
+          <w:rFonts w:ascii="Times New Roman" w:hAnsi="Times New Roman" w:cs="Times New Roman" w:eastAsia="Times New Roman"/>
+          <w:b w:val="0"/>
+          <w:i w:val="0"/>
+          <w:sz w:val="20"/>
+        </w:rPr>
+        <w:t>: blue; 1N4148 model, 5 V amplitude, 1 kHz) (device serial number: TOBB-7K3Q-0421)</w:t>
+      </w:r>
+    </w:p>
+    <w:p>
+      <w:pPr>
+        <w:keepNext/>
+        <w:spacing w:line="240" w:lineRule="auto" w:after="80"/>
+        <w:jc w:val="center"/>
+      </w:pPr>
+      <w:r>
+        <w:rPr>
+          <w:rFonts w:ascii="Times New Roman" w:hAnsi="Times New Roman" w:cs="Times New Roman" w:eastAsia="Times New Roman"/>
+          <w:b w:val="0"/>
+          <w:i w:val="0"/>
+          <w:sz w:val="20"/>
+        </w:rPr>
+        <w:t xml:space="preserve">Table 2.4.2  Cursor coordinates read in </w:t>
+      </w:r>
+      <w:r>
+        <w:rPr>
+          <w:rFonts w:ascii="Times New Roman" w:hAnsi="Times New Roman" w:cs="Times New Roman" w:eastAsia="Times New Roman"/>
+          <w:b w:val="0"/>
+          <w:i w:val="0"/>
+          <w:sz w:val="20"/>
+        </w:rPr>
+        <w:t>Figure 2.4.3</w:t>
+      </w:r>
+      <w:r>
+        <w:rPr>
+          <w:rFonts w:ascii="Times New Roman" w:hAnsi="Times New Roman" w:cs="Times New Roman" w:eastAsia="Times New Roman"/>
+          <w:b w:val="0"/>
+          <w:i w:val="0"/>
+          <w:sz w:val="20"/>
+        </w:rPr>
+        <w:t xml:space="preserve"> and the ngspice values at the same x</w:t>
+      </w:r>
+    </w:p>
+    <w:tbl>
+      <w:tblPr>
+        <w:tblW w:type="auto" w:w="0"/>
+        <w:jc w:val="center"/>
+        <w:tblLayout w:type="fixed"/>
+        <w:tblLook w:firstColumn="1" w:firstRow="1" w:lastColumn="0" w:lastRow="0" w:noHBand="0" w:noVBand="1" w:val="04A0"/>
+      </w:tblPr>
+      <w:tblGrid>
+        <w:gridCol w:w="794"/>
+        <w:gridCol w:w="1928"/>
+        <w:gridCol w:w="1247"/>
+        <w:gridCol w:w="1701"/>
+        <w:gridCol w:w="1701"/>
+        <w:gridCol w:w="1474"/>
+      </w:tblGrid>
+      <w:tr>
+        <w:trPr>
+          <w:tblHeader/>
+          <w:cantSplit/>
+        </w:trPr>
+        <w:tc>
+          <w:tcPr>
+            <w:tcW w:type="dxa" w:w="794"/>
+            <w:tcBorders>
+              <w:top w:val="single" w:sz="4" w:space="0" w:color="000000"/>
+              <w:left w:val="single" w:sz="4" w:space="0" w:color="000000"/>
+              <w:bottom w:val="single" w:sz="4" w:space="0" w:color="000000"/>
+              <w:right w:val="single" w:sz="4" w:space="0" w:color="000000"/>
+            </w:tcBorders>
+            <w:shd w:val="clear" w:color="auto" w:fill="D9D9D9"/>
+          </w:tcPr>
+          <w:p>
+            <w:pPr>
+              <w:keepNext/>
+              <w:spacing w:line="240" w:lineRule="auto" w:after="20"/>
+              <w:jc w:val="left"/>
+            </w:pPr>
+            <w:r>
+              <w:rPr>
+                <w:rFonts w:ascii="Times New Roman" w:hAnsi="Times New Roman" w:cs="Times New Roman" w:eastAsia="Times New Roman"/>
+                <w:b/>
+                <w:i w:val="0"/>
+                <w:sz w:val="17"/>
+              </w:rPr>
+              <w:t>Cursor</w:t>
+            </w:r>
+          </w:p>
+        </w:tc>
+        <w:tc>
+          <w:tcPr>
+            <w:tcW w:type="dxa" w:w="1928"/>
+            <w:tcBorders>
+              <w:top w:val="single" w:sz="4" w:space="0" w:color="000000"/>
+              <w:left w:val="single" w:sz="4" w:space="0" w:color="000000"/>
+              <w:bottom w:val="single" w:sz="4" w:space="0" w:color="000000"/>
+              <w:right w:val="single" w:sz="4" w:space="0" w:color="000000"/>
+            </w:tcBorders>
+            <w:shd w:val="clear" w:color="auto" w:fill="D9D9D9"/>
+          </w:tcPr>
+          <w:p>
+            <w:pPr>
+              <w:keepNext/>
+              <w:spacing w:line="240" w:lineRule="auto" w:after="20"/>
+              <w:jc w:val="center"/>
+            </w:pPr>
+            <w:r>
+              <w:rPr>
+                <w:rFonts w:ascii="Times New Roman" w:hAnsi="Times New Roman" w:cs="Times New Roman" w:eastAsia="Times New Roman"/>
+                <w:b/>
+                <w:i w:val="0"/>
+                <w:sz w:val="17"/>
+              </w:rPr>
+              <w:t>x coordinate</w:t>
+            </w:r>
+          </w:p>
+        </w:tc>
+        <w:tc>
+          <w:tcPr>
+            <w:tcW w:type="dxa" w:w="1247"/>
+            <w:tcBorders>
+              <w:top w:val="single" w:sz="4" w:space="0" w:color="000000"/>
+              <w:left w:val="single" w:sz="4" w:space="0" w:color="000000"/>
+              <w:bottom w:val="single" w:sz="4" w:space="0" w:color="000000"/>
+              <w:right w:val="single" w:sz="4" w:space="0" w:color="000000"/>
+            </w:tcBorders>
+            <w:shd w:val="clear" w:color="auto" w:fill="D9D9D9"/>
+          </w:tcPr>
+          <w:p>
+            <w:pPr>
+              <w:keepNext/>
+              <w:spacing w:line="240" w:lineRule="auto" w:after="20"/>
+              <w:jc w:val="center"/>
+            </w:pPr>
+            <w:r>
+              <w:rPr>
+                <w:rFonts w:ascii="Times New Roman" w:hAnsi="Times New Roman" w:cs="Times New Roman" w:eastAsia="Times New Roman"/>
+                <w:b/>
+                <w:i w:val="0"/>
+                <w:sz w:val="17"/>
+              </w:rPr>
+              <w:t>Quantity</w:t>
+            </w:r>
+          </w:p>
+        </w:tc>
+        <w:tc>
+          <w:tcPr>
+            <w:tcW w:type="dxa" w:w="1701"/>
+            <w:tcBorders>
+              <w:top w:val="single" w:sz="4" w:space="0" w:color="000000"/>
+              <w:left w:val="single" w:sz="4" w:space="0" w:color="000000"/>
+              <w:bottom w:val="single" w:sz="4" w:space="0" w:color="000000"/>
+              <w:right w:val="single" w:sz="4" w:space="0" w:color="000000"/>
+            </w:tcBorders>
+            <w:shd w:val="clear" w:color="auto" w:fill="D9D9D9"/>
+          </w:tcPr>
+          <w:p>
+            <w:pPr>
+              <w:keepNext/>
+              <w:spacing w:line="240" w:lineRule="auto" w:after="20"/>
+              <w:jc w:val="center"/>
+            </w:pPr>
+            <w:r>
+              <w:rPr>
+                <w:rFonts w:ascii="Times New Roman" w:hAnsi="Times New Roman" w:cs="Times New Roman" w:eastAsia="Times New Roman"/>
+                <w:b/>
+                <w:i w:val="0"/>
+                <w:sz w:val="17"/>
+              </w:rPr>
+              <w:t>LTspice</w:t>
+            </w:r>
+          </w:p>
+        </w:tc>
+        <w:tc>
+          <w:tcPr>
+            <w:tcW w:type="dxa" w:w="1701"/>
+            <w:tcBorders>
+              <w:top w:val="single" w:sz="4" w:space="0" w:color="000000"/>
+              <w:left w:val="single" w:sz="4" w:space="0" w:color="000000"/>
+              <w:bottom w:val="single" w:sz="4" w:space="0" w:color="000000"/>
+              <w:right w:val="single" w:sz="4" w:space="0" w:color="000000"/>
+            </w:tcBorders>
+            <w:shd w:val="clear" w:color="auto" w:fill="D9D9D9"/>
+          </w:tcPr>
+          <w:p>
+            <w:pPr>
+              <w:keepNext/>
+              <w:spacing w:line="240" w:lineRule="auto" w:after="20"/>
+              <w:jc w:val="center"/>
+            </w:pPr>
+            <w:r>
+              <w:rPr>
+                <w:rFonts w:ascii="Times New Roman" w:hAnsi="Times New Roman" w:cs="Times New Roman" w:eastAsia="Times New Roman"/>
+                <w:b/>
+                <w:i w:val="0"/>
+                <w:sz w:val="17"/>
+              </w:rPr>
+              <w:t>ngspice</w:t>
+            </w:r>
+          </w:p>
+        </w:tc>
+        <w:tc>
+          <w:tcPr>
+            <w:tcW w:type="dxa" w:w="1474"/>
+            <w:tcBorders>
+              <w:top w:val="single" w:sz="4" w:space="0" w:color="000000"/>
+              <w:left w:val="single" w:sz="4" w:space="0" w:color="000000"/>
+              <w:bottom w:val="single" w:sz="4" w:space="0" w:color="000000"/>
+              <w:right w:val="single" w:sz="4" w:space="0" w:color="000000"/>
+            </w:tcBorders>
+            <w:shd w:val="clear" w:color="auto" w:fill="D9D9D9"/>
+          </w:tcPr>
+          <w:p>
+            <w:pPr>
+              <w:keepNext/>
+              <w:spacing w:line="240" w:lineRule="auto" w:after="20"/>
+              <w:jc w:val="center"/>
+            </w:pPr>
+            <w:r>
+              <w:rPr>
+                <w:rFonts w:ascii="Times New Roman" w:hAnsi="Times New Roman" w:cs="Times New Roman" w:eastAsia="Times New Roman"/>
+                <w:b/>
+                <w:i w:val="0"/>
+                <w:sz w:val="17"/>
+              </w:rPr>
+              <w:t>Difference</w:t>
+            </w:r>
+          </w:p>
+        </w:tc>
+      </w:tr>
+      <w:tr>
+        <w:trPr>
+          <w:cantSplit/>
+        </w:trPr>
+        <w:tc>
+          <w:tcPr>
+            <w:tcW w:type="dxa" w:w="794"/>
+            <w:tcBorders>
+              <w:top w:val="single" w:sz="4" w:space="0" w:color="000000"/>
+              <w:left w:val="single" w:sz="4" w:space="0" w:color="000000"/>
+              <w:bottom w:val="single" w:sz="4" w:space="0" w:color="000000"/>
+              <w:right w:val="single" w:sz="4" w:space="0" w:color="000000"/>
+            </w:tcBorders>
+          </w:tcPr>
+          <w:p>
+            <w:pPr>
+              <w:keepNext/>
+              <w:spacing w:line="240" w:lineRule="auto" w:after="20"/>
+              <w:jc w:val="left"/>
+            </w:pPr>
+            <w:r>
+              <w:rPr>
+                <w:rFonts w:ascii="Times New Roman" w:hAnsi="Times New Roman" w:cs="Times New Roman" w:eastAsia="Times New Roman"/>
+                <w:b w:val="0"/>
+                <w:i w:val="0"/>
+                <w:sz w:val="17"/>
+              </w:rPr>
+              <w:t>1</w:t>
+            </w:r>
+          </w:p>
+        </w:tc>
+        <w:tc>
+          <w:tcPr>
+            <w:tcW w:type="dxa" w:w="1928"/>
+            <w:tcBorders>
+              <w:top w:val="single" w:sz="4" w:space="0" w:color="000000"/>
+              <w:left w:val="single" w:sz="4" w:space="0" w:color="000000"/>
+              <w:bottom w:val="single" w:sz="4" w:space="0" w:color="000000"/>
+              <w:right w:val="single" w:sz="4" w:space="0" w:color="000000"/>
+            </w:tcBorders>
+          </w:tcPr>
+          <w:p>
+            <w:pPr>
+              <w:keepNext/>
+              <w:spacing w:line="240" w:lineRule="auto" w:after="20"/>
+              <w:jc w:val="center"/>
+            </w:pPr>
+            <w:r>
+              <w:rPr>
+                <w:rFonts w:ascii="Times New Roman" w:hAnsi="Times New Roman" w:cs="Times New Roman" w:eastAsia="Times New Roman"/>
+                <w:b w:val="0"/>
+                <w:i w:val="0"/>
+                <w:sz w:val="17"/>
+              </w:rPr>
+              <w:t>t = 249.68 µs</w:t>
+            </w:r>
+          </w:p>
+        </w:tc>
+        <w:tc>
+          <w:tcPr>
+            <w:tcW w:type="dxa" w:w="1247"/>
+            <w:tcBorders>
+              <w:top w:val="single" w:sz="4" w:space="0" w:color="000000"/>
+              <w:left w:val="single" w:sz="4" w:space="0" w:color="000000"/>
+              <w:bottom w:val="single" w:sz="4" w:space="0" w:color="000000"/>
+              <w:right w:val="single" w:sz="4" w:space="0" w:color="000000"/>
+            </w:tcBorders>
+          </w:tcPr>
+          <w:p>
+            <w:pPr>
+              <w:keepNext/>
+              <w:spacing w:line="240" w:lineRule="auto" w:after="20"/>
+              <w:jc w:val="center"/>
+            </w:pPr>
+            <m:oMath>
+              <m:sSub>
+                <m:e>
+                  <m:r>
+                    <m:t>V</m:t>
+                  </m:r>
+                </m:e>
+                <m:sub>
+                  <m:r>
+                    <m:t>O</m:t>
+                  </m:r>
+                </m:sub>
+              </m:sSub>
+            </m:oMath>
+          </w:p>
+        </w:tc>
+        <w:tc>
+          <w:tcPr>
+            <w:tcW w:type="dxa" w:w="1701"/>
+            <w:tcBorders>
+              <w:top w:val="single" w:sz="4" w:space="0" w:color="000000"/>
+              <w:left w:val="single" w:sz="4" w:space="0" w:color="000000"/>
+              <w:bottom w:val="single" w:sz="4" w:space="0" w:color="000000"/>
+              <w:right w:val="single" w:sz="4" w:space="0" w:color="000000"/>
+            </w:tcBorders>
+          </w:tcPr>
+          <w:p>
+            <w:pPr>
+              <w:keepNext/>
+              <w:spacing w:line="240" w:lineRule="auto" w:after="20"/>
+              <w:jc w:val="center"/>
+            </w:pPr>
+            <w:r>
+              <w:rPr>
+                <w:rFonts w:ascii="Times New Roman" w:hAnsi="Times New Roman" w:cs="Times New Roman" w:eastAsia="Times New Roman"/>
+                <w:b w:val="0"/>
+                <w:i w:val="0"/>
+                <w:sz w:val="17"/>
+              </w:rPr>
+              <w:t>4.3466 V</w:t>
+            </w:r>
+          </w:p>
+        </w:tc>
+        <w:tc>
+          <w:tcPr>
+            <w:tcW w:type="dxa" w:w="1701"/>
+            <w:tcBorders>
+              <w:top w:val="single" w:sz="4" w:space="0" w:color="000000"/>
+              <w:left w:val="single" w:sz="4" w:space="0" w:color="000000"/>
+              <w:bottom w:val="single" w:sz="4" w:space="0" w:color="000000"/>
+              <w:right w:val="single" w:sz="4" w:space="0" w:color="000000"/>
+            </w:tcBorders>
+          </w:tcPr>
+          <w:p>
+            <w:pPr>
+              <w:keepNext/>
+              <w:spacing w:line="240" w:lineRule="auto" w:after="20"/>
+              <w:jc w:val="center"/>
+            </w:pPr>
+            <w:r>
+              <w:rPr>
+                <w:rFonts w:ascii="Times New Roman" w:hAnsi="Times New Roman" w:cs="Times New Roman" w:eastAsia="Times New Roman"/>
+                <w:b w:val="0"/>
+                <w:i w:val="0"/>
+                <w:sz w:val="17"/>
+              </w:rPr>
+              <w:t>4.3467 V</w:t>
+            </w:r>
+          </w:p>
+        </w:tc>
+        <w:tc>
+          <w:tcPr>
+            <w:tcW w:type="dxa" w:w="1474"/>
+            <w:tcBorders>
+              <w:top w:val="single" w:sz="4" w:space="0" w:color="000000"/>
+              <w:left w:val="single" w:sz="4" w:space="0" w:color="000000"/>
+              <w:bottom w:val="single" w:sz="4" w:space="0" w:color="000000"/>
+              <w:right w:val="single" w:sz="4" w:space="0" w:color="000000"/>
+            </w:tcBorders>
+          </w:tcPr>
+          <w:p>
+            <w:pPr>
+              <w:keepNext/>
+              <w:spacing w:line="240" w:lineRule="auto" w:after="20"/>
+              <w:jc w:val="center"/>
+            </w:pPr>
+            <w:r>
+              <w:rPr>
+                <w:rFonts w:ascii="Times New Roman" w:hAnsi="Times New Roman" w:cs="Times New Roman" w:eastAsia="Times New Roman"/>
+                <w:b w:val="0"/>
+                <w:i w:val="0"/>
+                <w:sz w:val="17"/>
+              </w:rPr>
+              <w:t>-0.002%</w:t>
+            </w:r>
+          </w:p>
+        </w:tc>
+      </w:tr>
+      <w:tr>
+        <w:trPr>
+          <w:cantSplit/>
+        </w:trPr>
+        <w:tc>
+          <w:tcPr>
+            <w:tcW w:type="dxa" w:w="794"/>
+            <w:tcBorders>
+              <w:top w:val="single" w:sz="4" w:space="0" w:color="000000"/>
+              <w:left w:val="single" w:sz="4" w:space="0" w:color="000000"/>
+              <w:bottom w:val="single" w:sz="4" w:space="0" w:color="000000"/>
+              <w:right w:val="single" w:sz="4" w:space="0" w:color="000000"/>
+            </w:tcBorders>
+          </w:tcPr>
+          <w:p>
+            <w:pPr>
+              <w:keepNext w:val="0"/>
+              <w:spacing w:line="240" w:lineRule="auto" w:after="20"/>
+              <w:jc w:val="left"/>
+            </w:pPr>
+            <w:r>
+              <w:rPr>
+                <w:rFonts w:ascii="Times New Roman" w:hAnsi="Times New Roman" w:cs="Times New Roman" w:eastAsia="Times New Roman"/>
+                <w:b w:val="0"/>
+                <w:i w:val="0"/>
+                <w:sz w:val="17"/>
+              </w:rPr>
+              <w:t>2</w:t>
+            </w:r>
+          </w:p>
+        </w:tc>
+        <w:tc>
+          <w:tcPr>
+            <w:tcW w:type="dxa" w:w="1928"/>
+            <w:tcBorders>
+              <w:top w:val="single" w:sz="4" w:space="0" w:color="000000"/>
+              <w:left w:val="single" w:sz="4" w:space="0" w:color="000000"/>
+              <w:bottom w:val="single" w:sz="4" w:space="0" w:color="000000"/>
+              <w:right w:val="single" w:sz="4" w:space="0" w:color="000000"/>
+            </w:tcBorders>
+          </w:tcPr>
+          <w:p>
+            <w:pPr>
+              <w:keepNext w:val="0"/>
+              <w:spacing w:line="240" w:lineRule="auto" w:after="20"/>
+              <w:jc w:val="center"/>
+            </w:pPr>
+            <w:r>
+              <w:rPr>
+                <w:rFonts w:ascii="Times New Roman" w:hAnsi="Times New Roman" w:cs="Times New Roman" w:eastAsia="Times New Roman"/>
+                <w:b w:val="0"/>
+                <w:i w:val="0"/>
+                <w:sz w:val="17"/>
+              </w:rPr>
+              <w:t>t = 749.03 µs</w:t>
+            </w:r>
+          </w:p>
+        </w:tc>
+        <w:tc>
+          <w:tcPr>
+            <w:tcW w:type="dxa" w:w="1247"/>
+            <w:tcBorders>
+              <w:top w:val="single" w:sz="4" w:space="0" w:color="000000"/>
+              <w:left w:val="single" w:sz="4" w:space="0" w:color="000000"/>
+              <w:bottom w:val="single" w:sz="4" w:space="0" w:color="000000"/>
+              <w:right w:val="single" w:sz="4" w:space="0" w:color="000000"/>
+            </w:tcBorders>
+          </w:tcPr>
+          <w:p>
+            <w:pPr>
+              <w:keepNext w:val="0"/>
+              <w:spacing w:line="240" w:lineRule="auto" w:after="20"/>
+              <w:jc w:val="center"/>
+            </w:pPr>
+            <m:oMath>
+              <m:sSub>
+                <m:e>
+                  <m:r>
+                    <m:t>V</m:t>
+                  </m:r>
+                </m:e>
+                <m:sub>
+                  <m:r>
+                    <m:t>O</m:t>
+                  </m:r>
+                </m:sub>
+              </m:sSub>
+            </m:oMath>
+          </w:p>
+        </w:tc>
+        <w:tc>
+          <w:tcPr>
+            <w:tcW w:type="dxa" w:w="1701"/>
+            <w:tcBorders>
+              <w:top w:val="single" w:sz="4" w:space="0" w:color="000000"/>
+              <w:left w:val="single" w:sz="4" w:space="0" w:color="000000"/>
+              <w:bottom w:val="single" w:sz="4" w:space="0" w:color="000000"/>
+              <w:right w:val="single" w:sz="4" w:space="0" w:color="000000"/>
+            </w:tcBorders>
+          </w:tcPr>
+          <w:p>
+            <w:pPr>
+              <w:keepNext w:val="0"/>
+              <w:spacing w:line="240" w:lineRule="auto" w:after="20"/>
+              <w:jc w:val="center"/>
+            </w:pPr>
+            <w:r>
+              <w:rPr>
+                <w:rFonts w:ascii="Times New Roman" w:hAnsi="Times New Roman" w:cs="Times New Roman" w:eastAsia="Times New Roman"/>
+                <w:b w:val="0"/>
+                <w:i w:val="0"/>
+                <w:sz w:val="17"/>
+              </w:rPr>
+              <w:t>2.0291e−06 V</w:t>
+            </w:r>
+          </w:p>
+        </w:tc>
+        <w:tc>
+          <w:tcPr>
+            <w:tcW w:type="dxa" w:w="1701"/>
+            <w:tcBorders>
+              <w:top w:val="single" w:sz="4" w:space="0" w:color="000000"/>
+              <w:left w:val="single" w:sz="4" w:space="0" w:color="000000"/>
+              <w:bottom w:val="single" w:sz="4" w:space="0" w:color="000000"/>
+              <w:right w:val="single" w:sz="4" w:space="0" w:color="000000"/>
+            </w:tcBorders>
+          </w:tcPr>
+          <w:p>
+            <w:pPr>
+              <w:keepNext w:val="0"/>
+              <w:spacing w:line="240" w:lineRule="auto" w:after="20"/>
+              <w:jc w:val="center"/>
+            </w:pPr>
+            <w:r>
+              <w:rPr>
+                <w:rFonts w:ascii="Times New Roman" w:hAnsi="Times New Roman" w:cs="Times New Roman" w:eastAsia="Times New Roman"/>
+                <w:b w:val="0"/>
+                <w:i w:val="0"/>
+                <w:sz w:val="17"/>
+              </w:rPr>
+              <w:t>−2.8378e−06 V</w:t>
+            </w:r>
+          </w:p>
+        </w:tc>
+        <w:tc>
+          <w:tcPr>
+            <w:tcW w:type="dxa" w:w="1474"/>
+            <w:tcBorders>
+              <w:top w:val="single" w:sz="4" w:space="0" w:color="000000"/>
+              <w:left w:val="single" w:sz="4" w:space="0" w:color="000000"/>
+              <w:bottom w:val="single" w:sz="4" w:space="0" w:color="000000"/>
+              <w:right w:val="single" w:sz="4" w:space="0" w:color="000000"/>
+            </w:tcBorders>
+          </w:tcPr>
+          <w:p>
+            <w:pPr>
+              <w:keepNext w:val="0"/>
+              <w:spacing w:line="240" w:lineRule="auto" w:after="20"/>
+              <w:jc w:val="center"/>
+            </w:pPr>
+            <w:r>
+              <w:rPr>
+                <w:rFonts w:ascii="Times New Roman" w:hAnsi="Times New Roman" w:cs="Times New Roman" w:eastAsia="Times New Roman"/>
+                <w:b w:val="0"/>
+                <w:i w:val="0"/>
+                <w:sz w:val="17"/>
+              </w:rPr>
+              <w:t>+0.000 V</w:t>
+            </w:r>
+          </w:p>
+        </w:tc>
+      </w:tr>
+    </w:tbl>
+    <w:p>
+      <w:pPr>
+        <w:spacing w:after="120"/>
+      </w:pPr>
     </w:p>
     <w:p>
       <w:pPr>

</xml_diff>

<commit_message>
ELE224L: TOBB ETÜ kapak sayfası, öğrenci bilgileri, ek sorular bölümü
Co-Authored-By: Claude Sonnet 5.5 <noreply@anthropic.com>
Claude-Session: https://claude.ai/code/session_01Q71gHQtKJ86ZE2CtYTYSwP
</commit_message>
<xml_diff>
--- a/ele224l_on_calisma/out/EN_Experiment1_Preliminary_Report.docx
+++ b/ele224l_on_calisma/out/EN_Experiment1_Preliminary_Report.docx
@@ -4,60 +4,106 @@
   <w:body>
     <w:p>
       <w:pPr>
-        <w:spacing w:line="276" w:lineRule="auto" w:after="40"/>
+        <w:jc w:val="center"/>
+      </w:pPr>
+      <w:r>
+        <w:drawing>
+          <wp:inline xmlns:a="http://schemas.openxmlformats.org/drawingml/2006/main" xmlns:pic="http://schemas.openxmlformats.org/drawingml/2006/picture">
+            <wp:extent cx="5580000" cy="2072571"/>
+            <wp:docPr id="1" name="Picture 1"/>
+            <wp:cNvGraphicFramePr>
+              <a:graphicFrameLocks noChangeAspect="1"/>
+            </wp:cNvGraphicFramePr>
+            <a:graphic>
+              <a:graphicData uri="http://schemas.openxmlformats.org/drawingml/2006/picture">
+                <pic:pic>
+                  <pic:nvPicPr>
+                    <pic:cNvPr id="0" name="cover_banner.png"/>
+                    <pic:cNvPicPr/>
+                  </pic:nvPicPr>
+                  <pic:blipFill>
+                    <a:blip r:embed="rId10"/>
+                    <a:stretch>
+                      <a:fillRect/>
+                    </a:stretch>
+                  </pic:blipFill>
+                  <pic:spPr>
+                    <a:xfrm>
+                      <a:off x="0" y="0"/>
+                      <a:ext cx="5580000" cy="2072571"/>
+                    </a:xfrm>
+                    <a:prstGeom prst="rect"/>
+                  </pic:spPr>
+                </pic:pic>
+              </a:graphicData>
+            </a:graphic>
+          </wp:inline>
+        </w:drawing>
+      </w:r>
+    </w:p>
+    <w:p/>
+    <w:p/>
+    <w:p/>
+    <w:p>
+      <w:pPr>
+        <w:spacing w:line="276" w:lineRule="auto" w:after="160"/>
         <w:jc w:val="center"/>
       </w:pPr>
       <w:r>
         <w:rPr>
           <w:rFonts w:ascii="Times New Roman" w:hAnsi="Times New Roman" w:cs="Times New Roman" w:eastAsia="Times New Roman"/>
           <w:b/>
-          <w:sz w:val="28"/>
+          <w:sz w:val="32"/>
         </w:rPr>
         <w:t>TOBB University of Economics and Technology</w:t>
       </w:r>
     </w:p>
     <w:p>
       <w:pPr>
-        <w:spacing w:line="276" w:lineRule="auto" w:after="40"/>
+        <w:spacing w:line="276" w:lineRule="auto" w:after="160"/>
         <w:jc w:val="center"/>
       </w:pPr>
       <w:r>
         <w:rPr>
           <w:rFonts w:ascii="Times New Roman" w:hAnsi="Times New Roman" w:cs="Times New Roman" w:eastAsia="Times New Roman"/>
           <w:b w:val="0"/>
-          <w:sz w:val="24"/>
+          <w:sz w:val="28"/>
         </w:rPr>
         <w:t>Department of Electrical and Electronics Engineering</w:t>
       </w:r>
     </w:p>
     <w:p>
       <w:pPr>
-        <w:spacing w:line="276" w:lineRule="auto" w:after="40"/>
+        <w:spacing w:line="276" w:lineRule="auto" w:after="160"/>
         <w:jc w:val="center"/>
       </w:pPr>
       <w:r>
         <w:rPr>
           <w:rFonts w:ascii="Times New Roman" w:hAnsi="Times New Roman" w:cs="Times New Roman" w:eastAsia="Times New Roman"/>
           <w:b w:val="0"/>
-          <w:sz w:val="24"/>
+          <w:sz w:val="28"/>
         </w:rPr>
         <w:t>ELE 224L – Electronic Circuits Laboratory</w:t>
       </w:r>
     </w:p>
     <w:p>
       <w:pPr>
-        <w:spacing w:line="276" w:lineRule="auto" w:after="40"/>
+        <w:spacing w:line="276" w:lineRule="auto" w:after="160"/>
         <w:jc w:val="center"/>
       </w:pPr>
       <w:r>
         <w:rPr>
           <w:rFonts w:ascii="Times New Roman" w:hAnsi="Times New Roman" w:cs="Times New Roman" w:eastAsia="Times New Roman"/>
           <w:b/>
-          <w:sz w:val="26"/>
+          <w:sz w:val="30"/>
         </w:rPr>
         <w:t>Experiment 1 – Preliminary Work: PN Junction Diode</w:t>
       </w:r>
     </w:p>
+    <w:p/>
+    <w:p/>
+    <w:p/>
+    <w:p/>
     <w:tbl>
       <w:tblPr>
         <w:tblW w:type="auto" w:w="0"/>
@@ -81,13 +127,13 @@
           </w:tcPr>
           <w:p>
             <w:pPr>
-              <w:spacing w:line="276" w:lineRule="auto"/>
+              <w:spacing w:line="360" w:lineRule="auto"/>
             </w:pPr>
             <w:r>
               <w:rPr>
                 <w:rFonts w:ascii="Times New Roman" w:hAnsi="Times New Roman" w:cs="Times New Roman" w:eastAsia="Times New Roman"/>
                 <w:b/>
-                <w:sz w:val="24"/>
+                <w:sz w:val="26"/>
               </w:rPr>
               <w:t>Name Surname</w:t>
             </w:r>
@@ -105,14 +151,15 @@
           </w:tcPr>
           <w:p>
             <w:pPr>
-              <w:spacing w:line="276" w:lineRule="auto"/>
+              <w:spacing w:line="360" w:lineRule="auto"/>
             </w:pPr>
             <w:r>
               <w:rPr>
                 <w:rFonts w:ascii="Times New Roman" w:hAnsi="Times New Roman" w:cs="Times New Roman" w:eastAsia="Times New Roman"/>
                 <w:b w:val="0"/>
-                <w:sz w:val="24"/>
+                <w:sz w:val="26"/>
               </w:rPr>
+              <w:t>Beşir Kerem Üstüntürk</w:t>
             </w:r>
           </w:p>
         </w:tc>
@@ -130,13 +177,13 @@
           </w:tcPr>
           <w:p>
             <w:pPr>
-              <w:spacing w:line="276" w:lineRule="auto"/>
+              <w:spacing w:line="360" w:lineRule="auto"/>
             </w:pPr>
             <w:r>
               <w:rPr>
                 <w:rFonts w:ascii="Times New Roman" w:hAnsi="Times New Roman" w:cs="Times New Roman" w:eastAsia="Times New Roman"/>
                 <w:b/>
-                <w:sz w:val="24"/>
+                <w:sz w:val="26"/>
               </w:rPr>
               <w:t>Student ID</w:t>
             </w:r>
@@ -154,14 +201,15 @@
           </w:tcPr>
           <w:p>
             <w:pPr>
-              <w:spacing w:line="276" w:lineRule="auto"/>
+              <w:spacing w:line="360" w:lineRule="auto"/>
             </w:pPr>
             <w:r>
               <w:rPr>
                 <w:rFonts w:ascii="Times New Roman" w:hAnsi="Times New Roman" w:cs="Times New Roman" w:eastAsia="Times New Roman"/>
                 <w:b w:val="0"/>
-                <w:sz w:val="24"/>
+                <w:sz w:val="26"/>
               </w:rPr>
+              <w:t>251201037</w:t>
             </w:r>
           </w:p>
         </w:tc>
@@ -179,13 +227,13 @@
           </w:tcPr>
           <w:p>
             <w:pPr>
-              <w:spacing w:line="276" w:lineRule="auto"/>
+              <w:spacing w:line="360" w:lineRule="auto"/>
             </w:pPr>
             <w:r>
               <w:rPr>
                 <w:rFonts w:ascii="Times New Roman" w:hAnsi="Times New Roman" w:cs="Times New Roman" w:eastAsia="Times New Roman"/>
                 <w:b/>
-                <w:sz w:val="24"/>
+                <w:sz w:val="26"/>
               </w:rPr>
               <w:t>Date</w:t>
             </w:r>
@@ -203,20 +251,25 @@
           </w:tcPr>
           <w:p>
             <w:pPr>
-              <w:spacing w:line="276" w:lineRule="auto"/>
+              <w:spacing w:line="360" w:lineRule="auto"/>
             </w:pPr>
             <w:r>
               <w:rPr>
                 <w:rFonts w:ascii="Times New Roman" w:hAnsi="Times New Roman" w:cs="Times New Roman" w:eastAsia="Times New Roman"/>
                 <w:b w:val="0"/>
-                <w:sz w:val="24"/>
+                <w:sz w:val="26"/>
               </w:rPr>
+              <w:t>October 11, 2026</w:t>
             </w:r>
           </w:p>
         </w:tc>
       </w:tr>
     </w:tbl>
-    <w:p/>
+    <w:p>
+      <w:r>
+        <w:br w:type="page"/>
+      </w:r>
+    </w:p>
     <w:p>
       <w:pPr>
         <w:keepNext/>
@@ -1091,7 +1144,7 @@
         <w:drawing>
           <wp:inline xmlns:a="http://schemas.openxmlformats.org/drawingml/2006/main" xmlns:pic="http://schemas.openxmlformats.org/drawingml/2006/picture">
             <wp:extent cx="5400000" cy="2040000"/>
-            <wp:docPr id="1" name="Picture 1"/>
+            <wp:docPr id="2" name="Picture 2"/>
             <wp:cNvGraphicFramePr>
               <a:graphicFrameLocks noChangeAspect="1"/>
             </wp:cNvGraphicFramePr>
@@ -1103,7 +1156,7 @@
                     <pic:cNvPicPr/>
                   </pic:nvPicPr>
                   <pic:blipFill>
-                    <a:blip r:embed="rId10"/>
+                    <a:blip r:embed="rId11"/>
                     <a:stretch>
                       <a:fillRect/>
                     </a:stretch>
@@ -1513,7 +1566,7 @@
         <w:drawing>
           <wp:inline xmlns:a="http://schemas.openxmlformats.org/drawingml/2006/main" xmlns:pic="http://schemas.openxmlformats.org/drawingml/2006/picture">
             <wp:extent cx="5400000" cy="2053193"/>
-            <wp:docPr id="2" name="Picture 2"/>
+            <wp:docPr id="3" name="Picture 3"/>
             <wp:cNvGraphicFramePr>
               <a:graphicFrameLocks noChangeAspect="1"/>
             </wp:cNvGraphicFramePr>
@@ -1525,7 +1578,7 @@
                     <pic:cNvPicPr/>
                   </pic:nvPicPr>
                   <pic:blipFill>
-                    <a:blip r:embed="rId11"/>
+                    <a:blip r:embed="rId12"/>
                     <a:stretch>
                       <a:fillRect/>
                     </a:stretch>
@@ -1896,7 +1949,7 @@
         <w:drawing>
           <wp:inline xmlns:a="http://schemas.openxmlformats.org/drawingml/2006/main" xmlns:pic="http://schemas.openxmlformats.org/drawingml/2006/picture">
             <wp:extent cx="3060000" cy="1649587"/>
-            <wp:docPr id="3" name="Picture 3"/>
+            <wp:docPr id="4" name="Picture 4"/>
             <wp:cNvGraphicFramePr>
               <a:graphicFrameLocks noChangeAspect="1"/>
             </wp:cNvGraphicFramePr>
@@ -1908,7 +1961,7 @@
                     <pic:cNvPicPr/>
                   </pic:nvPicPr>
                   <pic:blipFill>
-                    <a:blip r:embed="rId12"/>
+                    <a:blip r:embed="rId13"/>
                     <a:stretch>
                       <a:fillRect/>
                     </a:stretch>
@@ -7753,7 +7806,7 @@
         <w:drawing>
           <wp:inline xmlns:a="http://schemas.openxmlformats.org/drawingml/2006/main" xmlns:pic="http://schemas.openxmlformats.org/drawingml/2006/picture">
             <wp:extent cx="5400000" cy="2106000"/>
-            <wp:docPr id="4" name="Picture 4"/>
+            <wp:docPr id="5" name="Picture 5"/>
             <wp:cNvGraphicFramePr>
               <a:graphicFrameLocks noChangeAspect="1"/>
             </wp:cNvGraphicFramePr>
@@ -7765,7 +7818,7 @@
                     <pic:cNvPicPr/>
                   </pic:nvPicPr>
                   <pic:blipFill>
-                    <a:blip r:embed="rId13"/>
+                    <a:blip r:embed="rId14"/>
                     <a:stretch>
                       <a:fillRect/>
                     </a:stretch>
@@ -8223,7 +8276,7 @@
         <w:drawing>
           <wp:inline xmlns:a="http://schemas.openxmlformats.org/drawingml/2006/main" xmlns:pic="http://schemas.openxmlformats.org/drawingml/2006/picture">
             <wp:extent cx="5580000" cy="3487500"/>
-            <wp:docPr id="5" name="Picture 5"/>
+            <wp:docPr id="6" name="Picture 6"/>
             <wp:cNvGraphicFramePr>
               <a:graphicFrameLocks noChangeAspect="1"/>
             </wp:cNvGraphicFramePr>
@@ -8235,7 +8288,7 @@
                     <pic:cNvPicPr/>
                   </pic:nvPicPr>
                   <pic:blipFill>
-                    <a:blip r:embed="rId14"/>
+                    <a:blip r:embed="rId15"/>
                     <a:stretch>
                       <a:fillRect/>
                     </a:stretch>
@@ -12184,7 +12237,7 @@
         <w:drawing>
           <wp:inline xmlns:a="http://schemas.openxmlformats.org/drawingml/2006/main" xmlns:pic="http://schemas.openxmlformats.org/drawingml/2006/picture">
             <wp:extent cx="4860000" cy="2229882"/>
-            <wp:docPr id="6" name="Picture 6"/>
+            <wp:docPr id="7" name="Picture 7"/>
             <wp:cNvGraphicFramePr>
               <a:graphicFrameLocks noChangeAspect="1"/>
             </wp:cNvGraphicFramePr>
@@ -12196,7 +12249,7 @@
                     <pic:cNvPicPr/>
                   </pic:nvPicPr>
                   <pic:blipFill>
-                    <a:blip r:embed="rId15"/>
+                    <a:blip r:embed="rId16"/>
                     <a:stretch>
                       <a:fillRect/>
                     </a:stretch>
@@ -12843,7 +12896,7 @@
         <w:drawing>
           <wp:inline xmlns:a="http://schemas.openxmlformats.org/drawingml/2006/main" xmlns:pic="http://schemas.openxmlformats.org/drawingml/2006/picture">
             <wp:extent cx="4860000" cy="2229882"/>
-            <wp:docPr id="7" name="Picture 7"/>
+            <wp:docPr id="8" name="Picture 8"/>
             <wp:cNvGraphicFramePr>
               <a:graphicFrameLocks noChangeAspect="1"/>
             </wp:cNvGraphicFramePr>
@@ -12855,7 +12908,7 @@
                     <pic:cNvPicPr/>
                   </pic:nvPicPr>
                   <pic:blipFill>
-                    <a:blip r:embed="rId16"/>
+                    <a:blip r:embed="rId17"/>
                     <a:stretch>
                       <a:fillRect/>
                     </a:stretch>
@@ -12941,7 +12994,7 @@
         <w:drawing>
           <wp:inline xmlns:a="http://schemas.openxmlformats.org/drawingml/2006/main" xmlns:pic="http://schemas.openxmlformats.org/drawingml/2006/picture">
             <wp:extent cx="5580000" cy="3487500"/>
-            <wp:docPr id="8" name="Picture 8"/>
+            <wp:docPr id="9" name="Picture 9"/>
             <wp:cNvGraphicFramePr>
               <a:graphicFrameLocks noChangeAspect="1"/>
             </wp:cNvGraphicFramePr>
@@ -12953,7 +13006,7 @@
                     <pic:cNvPicPr/>
                   </pic:nvPicPr>
                   <pic:blipFill>
-                    <a:blip r:embed="rId17"/>
+                    <a:blip r:embed="rId18"/>
                     <a:stretch>
                       <a:fillRect/>
                     </a:stretch>

</xml_diff>